<commit_message>
State Pattern Bai 1
</commit_message>
<xml_diff>
--- a/NguyenHoVietKhoa_Lab2.docx
+++ b/NguyenHoVietKhoa_Lab2.docx
@@ -474,6 +474,7 @@
         <w:rPr>
           <w:rFonts w:ascii="Times New Roman" w:hAnsi="Times New Roman" w:cs="Times New Roman"/>
           <w:b/>
+          <w:noProof/>
           <w:sz w:val="26"/>
           <w:szCs w:val="26"/>
         </w:rPr>
@@ -543,11 +544,11 @@
           <w:szCs w:val="26"/>
         </w:rPr>
       </w:pPr>
-      <w:bookmarkStart w:id="0" w:name="_GoBack"/>
-      <w:r>
-        <w:rPr>
-          <w:rFonts w:ascii="Times New Roman" w:hAnsi="Times New Roman" w:cs="Times New Roman"/>
-          <w:b/>
+      <w:r>
+        <w:rPr>
+          <w:rFonts w:ascii="Times New Roman" w:hAnsi="Times New Roman" w:cs="Times New Roman"/>
+          <w:b/>
+          <w:noProof/>
           <w:sz w:val="26"/>
           <w:szCs w:val="26"/>
         </w:rPr>
@@ -587,17 +588,147 @@
           </wp:inline>
         </w:drawing>
       </w:r>
+    </w:p>
+    <w:p>
+      <w:pPr>
+        <w:rPr>
+          <w:rFonts w:ascii="Times New Roman" w:hAnsi="Times New Roman" w:cs="Times New Roman"/>
+          <w:b/>
+          <w:sz w:val="26"/>
+          <w:szCs w:val="26"/>
+        </w:rPr>
+      </w:pPr>
+    </w:p>
+    <w:p>
+      <w:pPr>
+        <w:rPr>
+          <w:rFonts w:ascii="Times New Roman" w:hAnsi="Times New Roman" w:cs="Times New Roman"/>
+          <w:b/>
+          <w:sz w:val="26"/>
+          <w:szCs w:val="26"/>
+        </w:rPr>
+      </w:pPr>
+    </w:p>
+    <w:p>
+      <w:pPr>
+        <w:rPr>
+          <w:rFonts w:ascii="Times New Roman" w:hAnsi="Times New Roman" w:cs="Times New Roman"/>
+          <w:b/>
+          <w:sz w:val="26"/>
+          <w:szCs w:val="26"/>
+        </w:rPr>
+      </w:pPr>
+    </w:p>
+    <w:p>
+      <w:pPr>
+        <w:rPr>
+          <w:rFonts w:ascii="Times New Roman" w:hAnsi="Times New Roman" w:cs="Times New Roman"/>
+          <w:b/>
+          <w:sz w:val="26"/>
+          <w:szCs w:val="26"/>
+        </w:rPr>
+      </w:pPr>
+      <w:r>
+        <w:rPr>
+          <w:rFonts w:ascii="Times New Roman" w:hAnsi="Times New Roman" w:cs="Times New Roman"/>
+          <w:b/>
+          <w:sz w:val="26"/>
+          <w:szCs w:val="26"/>
+        </w:rPr>
+        <w:lastRenderedPageBreak/>
+        <w:t>State, Strategy, Decorator Pattern</w:t>
+      </w:r>
+    </w:p>
+    <w:p>
+      <w:pPr>
+        <w:rPr>
+          <w:rFonts w:ascii="Times New Roman" w:hAnsi="Times New Roman" w:cs="Times New Roman"/>
+          <w:b/>
+          <w:sz w:val="26"/>
+          <w:szCs w:val="26"/>
+        </w:rPr>
+      </w:pPr>
+      <w:r>
+        <w:rPr>
+          <w:rFonts w:ascii="Times New Roman" w:hAnsi="Times New Roman" w:cs="Times New Roman"/>
+          <w:b/>
+          <w:sz w:val="26"/>
+          <w:szCs w:val="26"/>
+        </w:rPr>
+        <w:t xml:space="preserve">Bài 1: </w:t>
+      </w:r>
+    </w:p>
+    <w:p>
+      <w:pPr>
+        <w:rPr>
+          <w:rFonts w:ascii="Times New Roman" w:hAnsi="Times New Roman" w:cs="Times New Roman"/>
+          <w:b/>
+          <w:sz w:val="26"/>
+          <w:szCs w:val="26"/>
+        </w:rPr>
+      </w:pPr>
+      <w:r>
+        <w:rPr>
+          <w:rFonts w:ascii="Times New Roman" w:hAnsi="Times New Roman" w:cs="Times New Roman"/>
+          <w:b/>
+          <w:noProof/>
+          <w:sz w:val="26"/>
+          <w:szCs w:val="26"/>
+        </w:rPr>
+        <w:drawing>
+          <wp:inline distT="0" distB="0" distL="0" distR="0">
+            <wp:extent cx="6038850" cy="2476500"/>
+            <wp:effectExtent l="0" t="0" r="0" b="0"/>
+            <wp:docPr id="9" name="Picture 9"/>
+            <wp:cNvGraphicFramePr>
+              <a:graphicFrameLocks xmlns:a="http://schemas.openxmlformats.org/drawingml/2006/main" noChangeAspect="1"/>
+            </wp:cNvGraphicFramePr>
+            <a:graphic xmlns:a="http://schemas.openxmlformats.org/drawingml/2006/main">
+              <a:graphicData uri="http://schemas.openxmlformats.org/drawingml/2006/picture">
+                <pic:pic xmlns:pic="http://schemas.openxmlformats.org/drawingml/2006/picture">
+                  <pic:nvPicPr>
+                    <pic:cNvPr id="9" name="StatePattern.png"/>
+                    <pic:cNvPicPr/>
+                  </pic:nvPicPr>
+                  <pic:blipFill>
+                    <a:blip r:embed="rId12">
+                      <a:extLst>
+                        <a:ext uri="{28A0092B-C50C-407E-A947-70E740481C1C}">
+                          <a14:useLocalDpi xmlns:a14="http://schemas.microsoft.com/office/drawing/2010/main" val="0"/>
+                        </a:ext>
+                      </a:extLst>
+                    </a:blip>
+                    <a:stretch>
+                      <a:fillRect/>
+                    </a:stretch>
+                  </pic:blipFill>
+                  <pic:spPr>
+                    <a:xfrm>
+                      <a:off x="0" y="0"/>
+                      <a:ext cx="6038850" cy="2476500"/>
+                    </a:xfrm>
+                    <a:prstGeom prst="rect">
+                      <a:avLst/>
+                    </a:prstGeom>
+                  </pic:spPr>
+                </pic:pic>
+              </a:graphicData>
+            </a:graphic>
+          </wp:inline>
+        </w:drawing>
+      </w:r>
+    </w:p>
+    <w:p>
+      <w:pPr>
+        <w:rPr>
+          <w:rFonts w:ascii="Times New Roman" w:hAnsi="Times New Roman" w:cs="Times New Roman"/>
+          <w:b/>
+          <w:sz w:val="26"/>
+          <w:szCs w:val="26"/>
+        </w:rPr>
+      </w:pPr>
+      <w:bookmarkStart w:id="0" w:name="_GoBack"/>
       <w:bookmarkEnd w:id="0"/>
-    </w:p>
-    <w:p>
-      <w:pPr>
-        <w:rPr>
-          <w:rFonts w:ascii="Times New Roman" w:hAnsi="Times New Roman" w:cs="Times New Roman"/>
-          <w:b/>
-          <w:sz w:val="26"/>
-          <w:szCs w:val="26"/>
-        </w:rPr>
-      </w:pPr>
     </w:p>
     <w:p>
       <w:pPr>

</xml_diff>

<commit_message>
Strategy Pattern Bai 1
</commit_message>
<xml_diff>
--- a/NguyenHoVietKhoa_Lab2.docx
+++ b/NguyenHoVietKhoa_Lab2.docx
@@ -728,7 +728,77 @@
         </w:rPr>
       </w:pPr>
       <w:bookmarkStart w:id="0" w:name="_GoBack"/>
+      <w:r>
+        <w:rPr>
+          <w:rFonts w:ascii="Times New Roman" w:hAnsi="Times New Roman" w:cs="Times New Roman"/>
+          <w:b/>
+          <w:noProof/>
+          <w:sz w:val="26"/>
+          <w:szCs w:val="26"/>
+        </w:rPr>
+        <w:drawing>
+          <wp:inline distT="0" distB="0" distL="0" distR="0">
+            <wp:extent cx="3829050" cy="4829175"/>
+            <wp:effectExtent l="0" t="0" r="0" b="9525"/>
+            <wp:docPr id="10" name="Picture 10"/>
+            <wp:cNvGraphicFramePr>
+              <a:graphicFrameLocks xmlns:a="http://schemas.openxmlformats.org/drawingml/2006/main" noChangeAspect="1"/>
+            </wp:cNvGraphicFramePr>
+            <a:graphic xmlns:a="http://schemas.openxmlformats.org/drawingml/2006/main">
+              <a:graphicData uri="http://schemas.openxmlformats.org/drawingml/2006/picture">
+                <pic:pic xmlns:pic="http://schemas.openxmlformats.org/drawingml/2006/picture">
+                  <pic:nvPicPr>
+                    <pic:cNvPr id="10" name="StrategyPattern.png"/>
+                    <pic:cNvPicPr/>
+                  </pic:nvPicPr>
+                  <pic:blipFill>
+                    <a:blip r:embed="rId13">
+                      <a:extLst>
+                        <a:ext uri="{28A0092B-C50C-407E-A947-70E740481C1C}">
+                          <a14:useLocalDpi xmlns:a14="http://schemas.microsoft.com/office/drawing/2010/main" val="0"/>
+                        </a:ext>
+                      </a:extLst>
+                    </a:blip>
+                    <a:stretch>
+                      <a:fillRect/>
+                    </a:stretch>
+                  </pic:blipFill>
+                  <pic:spPr>
+                    <a:xfrm>
+                      <a:off x="0" y="0"/>
+                      <a:ext cx="3829050" cy="4829175"/>
+                    </a:xfrm>
+                    <a:prstGeom prst="rect">
+                      <a:avLst/>
+                    </a:prstGeom>
+                  </pic:spPr>
+                </pic:pic>
+              </a:graphicData>
+            </a:graphic>
+          </wp:inline>
+        </w:drawing>
+      </w:r>
       <w:bookmarkEnd w:id="0"/>
+    </w:p>
+    <w:p>
+      <w:pPr>
+        <w:rPr>
+          <w:rFonts w:ascii="Times New Roman" w:hAnsi="Times New Roman" w:cs="Times New Roman"/>
+          <w:b/>
+          <w:sz w:val="26"/>
+          <w:szCs w:val="26"/>
+        </w:rPr>
+      </w:pPr>
+    </w:p>
+    <w:p>
+      <w:pPr>
+        <w:rPr>
+          <w:rFonts w:ascii="Times New Roman" w:hAnsi="Times New Roman" w:cs="Times New Roman"/>
+          <w:b/>
+          <w:sz w:val="26"/>
+          <w:szCs w:val="26"/>
+        </w:rPr>
+      </w:pPr>
     </w:p>
     <w:p>
       <w:pPr>

</xml_diff>

<commit_message>
Decorator Pattern Bai 1
</commit_message>
<xml_diff>
--- a/NguyenHoVietKhoa_Lab2.docx
+++ b/NguyenHoVietKhoa_Lab2.docx
@@ -727,7 +727,6 @@
           <w:szCs w:val="26"/>
         </w:rPr>
       </w:pPr>
-      <w:bookmarkStart w:id="0" w:name="_GoBack"/>
       <w:r>
         <w:rPr>
           <w:rFonts w:ascii="Times New Roman" w:hAnsi="Times New Roman" w:cs="Times New Roman"/>
@@ -778,17 +777,69 @@
           </wp:inline>
         </w:drawing>
       </w:r>
+    </w:p>
+    <w:p>
+      <w:pPr>
+        <w:rPr>
+          <w:rFonts w:ascii="Times New Roman" w:hAnsi="Times New Roman" w:cs="Times New Roman"/>
+          <w:b/>
+          <w:sz w:val="26"/>
+          <w:szCs w:val="26"/>
+        </w:rPr>
+      </w:pPr>
+      <w:bookmarkStart w:id="0" w:name="_GoBack"/>
+      <w:r>
+        <w:rPr>
+          <w:rFonts w:ascii="Times New Roman" w:hAnsi="Times New Roman" w:cs="Times New Roman"/>
+          <w:b/>
+          <w:noProof/>
+          <w:sz w:val="26"/>
+          <w:szCs w:val="26"/>
+        </w:rPr>
+        <w:lastRenderedPageBreak/>
+        <w:drawing>
+          <wp:inline distT="0" distB="0" distL="0" distR="0">
+            <wp:extent cx="5943600" cy="4156075"/>
+            <wp:effectExtent l="0" t="0" r="0" b="0"/>
+            <wp:docPr id="11" name="Picture 11"/>
+            <wp:cNvGraphicFramePr>
+              <a:graphicFrameLocks xmlns:a="http://schemas.openxmlformats.org/drawingml/2006/main" noChangeAspect="1"/>
+            </wp:cNvGraphicFramePr>
+            <a:graphic xmlns:a="http://schemas.openxmlformats.org/drawingml/2006/main">
+              <a:graphicData uri="http://schemas.openxmlformats.org/drawingml/2006/picture">
+                <pic:pic xmlns:pic="http://schemas.openxmlformats.org/drawingml/2006/picture">
+                  <pic:nvPicPr>
+                    <pic:cNvPr id="11" name="DecoratorPattern.png"/>
+                    <pic:cNvPicPr/>
+                  </pic:nvPicPr>
+                  <pic:blipFill>
+                    <a:blip r:embed="rId14">
+                      <a:extLst>
+                        <a:ext uri="{28A0092B-C50C-407E-A947-70E740481C1C}">
+                          <a14:useLocalDpi xmlns:a14="http://schemas.microsoft.com/office/drawing/2010/main" val="0"/>
+                        </a:ext>
+                      </a:extLst>
+                    </a:blip>
+                    <a:stretch>
+                      <a:fillRect/>
+                    </a:stretch>
+                  </pic:blipFill>
+                  <pic:spPr>
+                    <a:xfrm>
+                      <a:off x="0" y="0"/>
+                      <a:ext cx="5943600" cy="4156075"/>
+                    </a:xfrm>
+                    <a:prstGeom prst="rect">
+                      <a:avLst/>
+                    </a:prstGeom>
+                  </pic:spPr>
+                </pic:pic>
+              </a:graphicData>
+            </a:graphic>
+          </wp:inline>
+        </w:drawing>
+      </w:r>
       <w:bookmarkEnd w:id="0"/>
-    </w:p>
-    <w:p>
-      <w:pPr>
-        <w:rPr>
-          <w:rFonts w:ascii="Times New Roman" w:hAnsi="Times New Roman" w:cs="Times New Roman"/>
-          <w:b/>
-          <w:sz w:val="26"/>
-          <w:szCs w:val="26"/>
-        </w:rPr>
-      </w:pPr>
     </w:p>
     <w:p>
       <w:pPr>

</xml_diff>